<commit_message>
Update Class 04 slides.
</commit_message>
<xml_diff>
--- a/class04w.docx
+++ b/class04w.docx
@@ -68,7 +68,7 @@
         </w:numPr>
       </w:pPr>
       <w:r>
-        <w:t xml:space="preserve">Demonstrate techniques and code that might be helpful for Lab 1, due next Wednesday 2025-09-16 at noon.</w:t>
+        <w:t xml:space="preserve">Demonstrate techniques and code that might be helpful for Lab 1, due next Wednesday 2025-09-17 at noon.</w:t>
       </w:r>
     </w:p>
     <w:bookmarkEnd w:id="20"/>
@@ -11013,7 +11013,7 @@
         <w:pStyle w:val="FirstParagraph"/>
       </w:pPr>
       <w:r>
-        <w:t xml:space="preserve">Note that this 95% credible interval (73.12, 74.89) is very similar to the confidence interval (73.15, 74.89).</w:t>
+        <w:t xml:space="preserve">90% credible interval (73.12, 74.89) is similar to 90% confidence interval (73.15, 74.89).</w:t>
       </w:r>
     </w:p>
     <w:bookmarkEnd w:id="92"/>
@@ -15329,7 +15329,7 @@
               <w:spacing w:before="16" w:after="16"/>
             </w:pPr>
             <w:r>
-              <w:t xml:space="preserve">By now, I’ve shown you everything you need to complete all Tasks for Lab 1, due next Wednesday at noon (2025-09-16.)</w:t>
+              <w:t xml:space="preserve">By now, I’ve shown you everything you need to complete all Tasks for Lab 1, due next Wednesday at noon (2025-09-17.)</w:t>
             </w:r>
           </w:p>
         </w:tc>

</xml_diff>